<commit_message>
SEO: remove noindex on public game/proof pages, fix per-game meta descriptions, bump cache version
</commit_message>
<xml_diff>
--- a/LottoIQ_Maintenance_Manual.docx
+++ b/LottoIQ_Maintenance_Manual.docx
@@ -5250,6 +5250,489 @@
       </w:pPr>
       <w:r>
         <w:t>games/custom/index.html is structurally different from the other four game pages — it is not a static stats dashboard but an upload flow (member names their game → uploads a CSV → confirms the auto-detected column layout → sees the analysis). It is gated Insider-only in its own DOMContentLoaded handler (Standard members see an upgrade prompt instead of the uploader). Its CSV parser only ever produces the generic “N1…Nk columns, numbers within a pool” shape — it has no path for Pick-style (digit) or Keno-style (large pool, many picks) games — so Due Score required no format guard here, unlike the ambiguity that exists for custom games added through the desktop lotto_generator.py tool (see add_custom_game(), which does support pick/keno formats and explicitly skips Due Score for pick format).</w:t>
+      </w:r>
+    </w:p>
+    <w:p>
+      <w:pPr>
+        <w:pStyle w:val="Heading2"/>
+        <w:pBdr>
+          <w:bottom w:val="single" w:sz="3" w:space="0" w:color="D4AF37"/>
+        </w:pBdr>
+      </w:pPr>
+      <w:r>
+        <w:t>3.9  Generator Weight Mode (Hot / Neutral / Cold) — July 2026</w:t>
+      </w:r>
+    </w:p>
+    <w:p>
+      <w:pPr>
+        <w:spacing w:after="120"/>
+      </w:pPr>
+      <w:r>
+        <w:t>Added a third dial to the Smart Number Generator, alongside the existing filters: members can now choose how the number pool itself is weighted before a set is drawn. Hot is the existing default and favours the most-frequent numbers, unchanged in behaviour from before this change. Cold — described in the UI as “against the grain” — favours the least-frequent numbers instead. Neutral removes frequency bias entirely, drawing uniformly at random from the pool within whatever other filters are set.</w:t>
+      </w:r>
+    </w:p>
+    <w:p>
+      <w:pPr>
+        <w:spacing w:after="120"/>
+      </w:pPr>
+      <w:r>
+        <w:t>No new randomness logic was introduced. generateOneSet() already picked numbers using Math.pow(Math.random(), skewExponent) against a weights array sorted by frequency — that formula always biases toward the front (low index) of the array. Hot and Cold are implemented purely by flipping which end of the frequency spectrum sits at index 0: Hot sorts the pool hottest-first (as it always has), Cold sorts it coldest-first. Neutral instead sets skewExponent to 1, which makes the pick uniform regardless of sort order. This means the change is a small, low-risk addition rather than a rewrite of the generator's core mechanism.</w:t>
+      </w:r>
+    </w:p>
+    <w:p>
+      <w:pPr>
+        <w:spacing w:after="120"/>
+      </w:pPr>
+      <w:r>
+        <w:rPr>
+          <w:b/>
+          <w:bCs/>
+        </w:rPr>
+        <w:t>Files changed:</w:t>
+      </w:r>
+    </w:p>
+    <w:tbl>
+      <w:tblPr>
+        <w:tblW w:w="9360" w:type="dxa"/>
+        <w:tblBorders>
+          <w:top w:val="single" w:sz="4" w:space="0" w:color="auto"/>
+          <w:left w:val="single" w:sz="4" w:space="0" w:color="auto"/>
+          <w:bottom w:val="single" w:sz="4" w:space="0" w:color="auto"/>
+          <w:right w:val="single" w:sz="4" w:space="0" w:color="auto"/>
+          <w:insideH w:val="single" w:sz="4" w:space="0" w:color="auto"/>
+          <w:insideV w:val="single" w:sz="4" w:space="0" w:color="auto"/>
+        </w:tblBorders>
+        <w:tblCellMar>
+          <w:left w:w="10" w:type="dxa"/>
+          <w:right w:w="10" w:type="dxa"/>
+        </w:tblCellMar>
+        <w:tblLook w:val="0000" w:firstRow="0" w:lastRow="0" w:firstColumn="0" w:lastColumn="0" w:noHBand="0" w:noVBand="0"/>
+      </w:tblPr>
+      <w:tblGrid>
+        <w:gridCol w:w="2400"/>
+        <w:gridCol w:w="6960"/>
+      </w:tblGrid>
+      <w:tr>
+        <w:tblPrEx>
+          <w:tblCellMar>
+            <w:top w:w="0" w:type="dxa"/>
+            <w:bottom w:w="0" w:type="dxa"/>
+          </w:tblCellMar>
+        </w:tblPrEx>
+        <w:tc>
+          <w:tcPr>
+            <w:tcW w:w="2400" w:type="dxa"/>
+            <w:tcBorders>
+              <w:top w:val="single" w:sz="1" w:space="0" w:color="CCCCCC"/>
+              <w:left w:val="single" w:sz="1" w:space="0" w:color="CCCCCC"/>
+              <w:bottom w:val="single" w:sz="1" w:space="0" w:color="CCCCCC"/>
+              <w:right w:val="single" w:sz="1" w:space="0" w:color="CCCCCC"/>
+            </w:tcBorders>
+            <w:shd w:val="clear" w:color="auto" w:fill="0A0E1A"/>
+            <w:tcMar>
+              <w:top w:w="100" w:type="dxa"/>
+              <w:left w:w="150" w:type="dxa"/>
+              <w:bottom w:w="100" w:type="dxa"/>
+              <w:right w:w="150" w:type="dxa"/>
+            </w:tcMar>
+          </w:tcPr>
+          <w:p>
+            <w:r>
+              <w:rPr>
+                <w:b/>
+                <w:bCs/>
+                <w:color w:val="FFFFFF"/>
+                <w:sz w:val="20"/>
+                <w:szCs w:val="20"/>
+              </w:rPr>
+              <w:t>File</w:t>
+            </w:r>
+          </w:p>
+        </w:tc>
+        <w:tc>
+          <w:tcPr>
+            <w:tcW w:w="6960" w:type="dxa"/>
+            <w:tcBorders>
+              <w:top w:val="single" w:sz="1" w:space="0" w:color="CCCCCC"/>
+              <w:left w:val="single" w:sz="1" w:space="0" w:color="CCCCCC"/>
+              <w:bottom w:val="single" w:sz="1" w:space="0" w:color="CCCCCC"/>
+              <w:right w:val="single" w:sz="1" w:space="0" w:color="CCCCCC"/>
+            </w:tcBorders>
+            <w:shd w:val="clear" w:color="auto" w:fill="0A0E1A"/>
+            <w:tcMar>
+              <w:top w:w="100" w:type="dxa"/>
+              <w:left w:w="150" w:type="dxa"/>
+              <w:bottom w:w="100" w:type="dxa"/>
+              <w:right w:w="150" w:type="dxa"/>
+            </w:tcMar>
+          </w:tcPr>
+          <w:p>
+            <w:r>
+              <w:rPr>
+                <w:b/>
+                <w:bCs/>
+                <w:color w:val="FFFFFF"/>
+                <w:sz w:val="20"/>
+                <w:szCs w:val="20"/>
+              </w:rPr>
+              <w:t>Change</w:t>
+            </w:r>
+          </w:p>
+        </w:tc>
+      </w:tr>
+      <w:tr>
+        <w:tblPrEx>
+          <w:tblCellMar>
+            <w:top w:w="0" w:type="dxa"/>
+            <w:bottom w:w="0" w:type="dxa"/>
+          </w:tblCellMar>
+        </w:tblPrEx>
+        <w:tc>
+          <w:tcPr>
+            <w:tcW w:w="2400" w:type="dxa"/>
+            <w:tcBorders>
+              <w:top w:val="single" w:sz="1" w:space="0" w:color="CCCCCC"/>
+              <w:left w:val="single" w:sz="1" w:space="0" w:color="CCCCCC"/>
+              <w:bottom w:val="single" w:sz="1" w:space="0" w:color="CCCCCC"/>
+              <w:right w:val="single" w:sz="1" w:space="0" w:color="CCCCCC"/>
+            </w:tcBorders>
+            <w:tcMar>
+              <w:top w:w="100" w:type="dxa"/>
+              <w:left w:w="150" w:type="dxa"/>
+              <w:bottom w:w="100" w:type="dxa"/>
+              <w:right w:w="150" w:type="dxa"/>
+            </w:tcMar>
+          </w:tcPr>
+          <w:p>
+            <w:r>
+              <w:rPr>
+                <w:sz w:val="20"/>
+                <w:szCs w:val="20"/>
+              </w:rPr>
+              <w:t>js/generator.js</w:t>
+            </w:r>
+          </w:p>
+        </w:tc>
+        <w:tc>
+          <w:tcPr>
+            <w:tcW w:w="6960" w:type="dxa"/>
+            <w:tcBorders>
+              <w:top w:val="single" w:sz="1" w:space="0" w:color="CCCCCC"/>
+              <w:left w:val="single" w:sz="1" w:space="0" w:color="CCCCCC"/>
+              <w:bottom w:val="single" w:sz="1" w:space="0" w:color="CCCCCC"/>
+              <w:right w:val="single" w:sz="1" w:space="0" w:color="CCCCCC"/>
+            </w:tcBorders>
+            <w:tcMar>
+              <w:top w:w="100" w:type="dxa"/>
+              <w:left w:w="150" w:type="dxa"/>
+              <w:bottom w:w="100" w:type="dxa"/>
+              <w:right w:w="150" w:type="dxa"/>
+            </w:tcMar>
+          </w:tcPr>
+          <w:p>
+            <w:r>
+              <w:rPr>
+                <w:sz w:val="20"/>
+                <w:szCs w:val="20"/>
+              </w:rPr>
+              <w:t>generateOneSet() gained a skewExponent parameter (default 1.5 — identical to the prior hard-coded value, so behaviour is unchanged unless a mode explicitly overrides it). The weights array’s sort direction now depends on the new weightMode value (‘hot’ sorts hottest-first as before; ‘cold’ sorts coldest-first). diagnoseGenerationFailure() and its internal relax-test helper now thread the same skewExponent through, so the failure diagnostic tests relaxations using whichever mode the member actually had selected. buildWhyBox() wording now reads “Hot-weighted” / “Cold-weighted” / “Unweighted — random” depending on mode. weightMode itself rides along in window._lastFilters and the per-set _filters object passed to the why-box explainer.</w:t>
+            </w:r>
+          </w:p>
+        </w:tc>
+      </w:tr>
+      <w:tr>
+        <w:tblPrEx>
+          <w:tblCellMar>
+            <w:top w:w="0" w:type="dxa"/>
+            <w:bottom w:w="0" w:type="dxa"/>
+          </w:tblCellMar>
+        </w:tblPrEx>
+        <w:tc>
+          <w:tcPr>
+            <w:tcW w:w="2400" w:type="dxa"/>
+            <w:tcBorders>
+              <w:top w:val="single" w:sz="1" w:space="0" w:color="CCCCCC"/>
+              <w:left w:val="single" w:sz="1" w:space="0" w:color="CCCCCC"/>
+              <w:bottom w:val="single" w:sz="1" w:space="0" w:color="CCCCCC"/>
+              <w:right w:val="single" w:sz="1" w:space="0" w:color="CCCCCC"/>
+            </w:tcBorders>
+            <w:tcMar>
+              <w:top w:w="100" w:type="dxa"/>
+              <w:left w:w="150" w:type="dxa"/>
+              <w:bottom w:w="100" w:type="dxa"/>
+              <w:right w:w="150" w:type="dxa"/>
+            </w:tcMar>
+          </w:tcPr>
+          <w:p>
+            <w:r>
+              <w:rPr>
+                <w:sz w:val="20"/>
+                <w:szCs w:val="20"/>
+              </w:rPr>
+              <w:t>js/auth.js</w:t>
+            </w:r>
+          </w:p>
+        </w:tc>
+        <w:tc>
+          <w:tcPr>
+            <w:tcW w:w="6960" w:type="dxa"/>
+            <w:tcBorders>
+              <w:top w:val="single" w:sz="1" w:space="0" w:color="CCCCCC"/>
+              <w:left w:val="single" w:sz="1" w:space="0" w:color="CCCCCC"/>
+              <w:bottom w:val="single" w:sz="1" w:space="0" w:color="CCCCCC"/>
+              <w:right w:val="single" w:sz="1" w:space="0" w:color="CCCCCC"/>
+            </w:tcBorders>
+            <w:tcMar>
+              <w:top w:w="100" w:type="dxa"/>
+              <w:left w:w="150" w:type="dxa"/>
+              <w:bottom w:w="100" w:type="dxa"/>
+              <w:right w:w="150" w:type="dxa"/>
+            </w:tcMar>
+          </w:tcPr>
+          <w:p>
+            <w:r>
+              <w:rPr>
+                <w:sz w:val="20"/>
+                <w:szCs w:val="20"/>
+              </w:rPr>
+              <w:t>unlockInsiderUI() gained one explicit line: weightMode.disabled = false. This was a necessary fix, not just an addition — the generic loop that strips the .filter-locked class only restores the visual look (opacity, pointer-events); it never clears a form control’s native disabled attribute. Every other locked filter (topPair, spreadFilter, numSets, neverAppeared) already had its own explicit disabled-clear line for this reason — weightMode now matches that existing pattern.</w:t>
+            </w:r>
+          </w:p>
+        </w:tc>
+      </w:tr>
+      <w:tr>
+        <w:tblPrEx>
+          <w:tblCellMar>
+            <w:top w:w="0" w:type="dxa"/>
+            <w:bottom w:w="0" w:type="dxa"/>
+          </w:tblCellMar>
+        </w:tblPrEx>
+        <w:tc>
+          <w:tcPr>
+            <w:tcW w:w="2400" w:type="dxa"/>
+            <w:tcBorders>
+              <w:top w:val="single" w:sz="1" w:space="0" w:color="CCCCCC"/>
+              <w:left w:val="single" w:sz="1" w:space="0" w:color="CCCCCC"/>
+              <w:bottom w:val="single" w:sz="1" w:space="0" w:color="CCCCCC"/>
+              <w:right w:val="single" w:sz="1" w:space="0" w:color="CCCCCC"/>
+            </w:tcBorders>
+            <w:tcMar>
+              <w:top w:w="100" w:type="dxa"/>
+              <w:left w:w="150" w:type="dxa"/>
+              <w:bottom w:w="100" w:type="dxa"/>
+              <w:right w:w="150" w:type="dxa"/>
+            </w:tcMar>
+          </w:tcPr>
+          <w:p>
+            <w:r>
+              <w:rPr>
+                <w:sz w:val="20"/>
+                <w:szCs w:val="20"/>
+              </w:rPr>
+              <w:t>games/lotto-649, lotto-max, lottario, ontario-49 (index.html)</w:t>
+            </w:r>
+          </w:p>
+        </w:tc>
+        <w:tc>
+          <w:tcPr>
+            <w:tcW w:w="6960" w:type="dxa"/>
+            <w:tcBorders>
+              <w:top w:val="single" w:sz="1" w:space="0" w:color="CCCCCC"/>
+              <w:left w:val="single" w:sz="1" w:space="0" w:color="CCCCCC"/>
+              <w:bottom w:val="single" w:sz="1" w:space="0" w:color="CCCCCC"/>
+              <w:right w:val="single" w:sz="1" w:space="0" w:color="CCCCCC"/>
+            </w:tcBorders>
+            <w:tcMar>
+              <w:top w:w="100" w:type="dxa"/>
+              <w:left w:w="150" w:type="dxa"/>
+              <w:bottom w:w="100" w:type="dxa"/>
+              <w:right w:w="150" w:type="dxa"/>
+            </w:tcMar>
+          </w:tcPr>
+          <w:p>
+            <w:r>
+              <w:rPr>
+                <w:sz w:val="20"/>
+                <w:szCs w:val="20"/>
+              </w:rPr>
+              <w:t>Added a new “Number weighting” filter-group (class filter-group filter-locked, matching the existing Top Pair / My Numbers markup exactly) with a 3-option select: Hot (default, selected) / Neutral / Cold.</w:t>
+            </w:r>
+          </w:p>
+        </w:tc>
+      </w:tr>
+      <w:tr>
+        <w:tblPrEx>
+          <w:tblCellMar>
+            <w:top w:w="0" w:type="dxa"/>
+            <w:bottom w:w="0" w:type="dxa"/>
+          </w:tblCellMar>
+        </w:tblPrEx>
+        <w:tc>
+          <w:tcPr>
+            <w:tcW w:w="2400" w:type="dxa"/>
+            <w:tcBorders>
+              <w:top w:val="single" w:sz="1" w:space="0" w:color="CCCCCC"/>
+              <w:left w:val="single" w:sz="1" w:space="0" w:color="CCCCCC"/>
+              <w:bottom w:val="single" w:sz="1" w:space="0" w:color="CCCCCC"/>
+              <w:right w:val="single" w:sz="1" w:space="0" w:color="CCCCCC"/>
+            </w:tcBorders>
+            <w:tcMar>
+              <w:top w:w="100" w:type="dxa"/>
+              <w:left w:w="150" w:type="dxa"/>
+              <w:bottom w:w="100" w:type="dxa"/>
+              <w:right w:w="150" w:type="dxa"/>
+            </w:tcMar>
+          </w:tcPr>
+          <w:p>
+            <w:r>
+              <w:rPr>
+                <w:sz w:val="20"/>
+                <w:szCs w:val="20"/>
+              </w:rPr>
+              <w:t>games/custom/index.html</w:t>
+            </w:r>
+          </w:p>
+        </w:tc>
+        <w:tc>
+          <w:tcPr>
+            <w:tcW w:w="6960" w:type="dxa"/>
+            <w:tcBorders>
+              <w:top w:val="single" w:sz="1" w:space="0" w:color="CCCCCC"/>
+              <w:left w:val="single" w:sz="1" w:space="0" w:color="CCCCCC"/>
+              <w:bottom w:val="single" w:sz="1" w:space="0" w:color="CCCCCC"/>
+              <w:right w:val="single" w:sz="1" w:space="0" w:color="CCCCCC"/>
+            </w:tcBorders>
+            <w:tcMar>
+              <w:top w:w="100" w:type="dxa"/>
+              <w:left w:w="150" w:type="dxa"/>
+              <w:bottom w:w="100" w:type="dxa"/>
+              <w:right w:w="150" w:type="dxa"/>
+            </w:tcMar>
+          </w:tcPr>
+          <w:p>
+            <w:r>
+              <w:rPr>
+                <w:sz w:val="20"/>
+                <w:szCs w:val="20"/>
+              </w:rPr>
+              <w:t>Added the same select, but without the filter-locked wrapper or the disabled attribute — matching this page’s existing pattern of shipping every filter already unlocked, since the whole page is Insider-gated at the page level (see 3.8.1).</w:t>
+            </w:r>
+          </w:p>
+        </w:tc>
+      </w:tr>
+      <w:tr>
+        <w:tblPrEx>
+          <w:tblCellMar>
+            <w:top w:w="0" w:type="dxa"/>
+            <w:bottom w:w="0" w:type="dxa"/>
+          </w:tblCellMar>
+        </w:tblPrEx>
+        <w:tc>
+          <w:tcPr>
+            <w:tcW w:w="2400" w:type="dxa"/>
+            <w:tcBorders>
+              <w:top w:val="single" w:sz="1" w:space="0" w:color="CCCCCC"/>
+              <w:left w:val="single" w:sz="1" w:space="0" w:color="CCCCCC"/>
+              <w:bottom w:val="single" w:sz="1" w:space="0" w:color="CCCCCC"/>
+              <w:right w:val="single" w:sz="1" w:space="0" w:color="CCCCCC"/>
+            </w:tcBorders>
+            <w:tcMar>
+              <w:top w:w="100" w:type="dxa"/>
+              <w:left w:w="150" w:type="dxa"/>
+              <w:bottom w:w="100" w:type="dxa"/>
+              <w:right w:w="150" w:type="dxa"/>
+            </w:tcMar>
+          </w:tcPr>
+          <w:p>
+            <w:r>
+              <w:rPr>
+                <w:sz w:val="20"/>
+                <w:szCs w:val="20"/>
+              </w:rPr>
+              <w:t>css/generator.css</w:t>
+            </w:r>
+          </w:p>
+        </w:tc>
+        <w:tc>
+          <w:tcPr>
+            <w:tcW w:w="6960" w:type="dxa"/>
+            <w:tcBorders>
+              <w:top w:val="single" w:sz="1" w:space="0" w:color="CCCCCC"/>
+              <w:left w:val="single" w:sz="1" w:space="0" w:color="CCCCCC"/>
+              <w:bottom w:val="single" w:sz="1" w:space="0" w:color="CCCCCC"/>
+              <w:right w:val="single" w:sz="1" w:space="0" w:color="CCCCCC"/>
+            </w:tcBorders>
+            <w:tcMar>
+              <w:top w:w="100" w:type="dxa"/>
+              <w:left w:w="150" w:type="dxa"/>
+              <w:bottom w:w="100" w:type="dxa"/>
+              <w:right w:w="150" w:type="dxa"/>
+            </w:tcMar>
+          </w:tcPr>
+          <w:p>
+            <w:r>
+              <w:rPr>
+                <w:sz w:val="20"/>
+                <w:szCs w:val="20"/>
+              </w:rPr>
+              <w:t>No changes required. The new control reuses only pre-existing generic classes (.filter-group, .filter-locked, .filter-select, .locked-badge), so it inherits identical styling automatically — confirmed by inspecting the existing rules before shipping rather than assuming.</w:t>
+            </w:r>
+          </w:p>
+        </w:tc>
+      </w:tr>
+    </w:tbl>
+    <w:p>
+      <w:pPr>
+        <w:spacing w:after="120"/>
+      </w:pPr>
+      <w:r>
+        <w:rPr>
+          <w:b/>
+          <w:bCs/>
+        </w:rPr>
+        <w:t xml:space="preserve">Tier gating: </w:t>
+      </w:r>
+      <w:r>
+        <w:t>Standard members are locked to Hot, matching current behaviour exactly (the code falls back to ‘hot’ if the #weightMode element is missing, disabled, or absent from a page entirely, so this is a no-op change for any page not yet updated). Insider members can switch freely between Hot, Neutral, and Cold. This is the same .filter-locked convention already documented in the Section 4.3 auth-gate table — no new tier-checking logic was added beyond the one auth.js line above.</w:t>
+      </w:r>
+    </w:p>
+    <w:p>
+      <w:pPr>
+        <w:spacing w:after="120"/>
+      </w:pPr>
+      <w:r>
+        <w:rPr>
+          <w:b/>
+          <w:bCs/>
+        </w:rPr>
+        <w:t xml:space="preserve">Known gap — not yet resolved: </w:t>
+      </w:r>
+      <w:r>
+        <w:t>js/render.js was not available when this change was made. The primary why-box explainer used during normal generation, explainGeneratedSet(), lives in render.js and now receives weightMode inside its filters argument — but its own wording was not inspected or updated. If it has its own hard-coded “frequency-weighted” string, that copy will need the same three-way treatment given to buildWhyBox() in generator.js. Worth checking before calling this feature fully finished.</w:t>
+      </w:r>
+    </w:p>
+    <w:p>
+      <w:pPr>
+        <w:pBdr>
+          <w:left w:val="single" w:sz="6" w:space="0" w:color="155724"/>
+        </w:pBdr>
+        <w:shd w:val="clear" w:color="auto" w:fill="D4EDDA"/>
+        <w:spacing w:before="120" w:after="120"/>
+        <w:ind w:left="200" w:right="200"/>
+      </w:pPr>
+      <w:r>
+        <w:rPr>
+          <w:b/>
+          <w:bCs/>
+          <w:color w:val="155724"/>
+        </w:rPr>
+        <w:t xml:space="preserve">Deployment status: </w:t>
+      </w:r>
+      <w:r>
+        <w:rPr>
+          <w:color w:val="155724"/>
+        </w:rPr>
+        <w:t>Built and delivered as files. Not yet pushed to GitHub/Netlify and not yet tested live — copy the updated files into C:\lottoiq_live\website\ and follow the standard deploy workflow in 3.4, then verify per the pattern in 4.10 (a Standard test account should see Hot only; an Insider test account should be able to switch to Neutral and Cold and see the why-box wording change accordingly) before considering this feature closed.</w:t>
       </w:r>
     </w:p>
     <w:p>

</xml_diff>